<commit_message>
Update ICT2502C Network Security AY2324 Trimester 3 Assignment on Real-World Network Attacks and Defenses.docx
</commit_message>
<xml_diff>
--- a/ICT2502C Network Security AY2324 Trimester 3 Assignment on Real-World Network Attacks and Defenses.docx
+++ b/ICT2502C Network Security AY2324 Trimester 3 Assignment on Real-World Network Attacks and Defenses.docx
@@ -10,7 +10,6 @@
           <w:docPartUnique/>
         </w:docPartObj>
       </w:sdtPr>
-      <w:sdtEndPr/>
       <w:sdtContent>
         <w:p>
           <w:r>
@@ -357,7 +356,6 @@
                                   <w:dataBinding w:prefixMappings="xmlns:ns0='http://purl.org/dc/elements/1.1/' xmlns:ns1='http://schemas.openxmlformats.org/package/2006/metadata/core-properties' " w:xpath="/ns1:coreProperties[1]/ns0:creator[1]" w:storeItemID="{6C3C8BC8-F283-45AE-878A-BAB7291924A1}"/>
                                   <w:text/>
                                 </w:sdtPr>
-                                <w:sdtEndPr/>
                                 <w:sdtContent>
                                   <w:p>
                                     <w:pPr>
@@ -407,7 +405,6 @@
                                     <w:dataBinding w:prefixMappings="xmlns:ns0='http://schemas.microsoft.com/office/2006/coverPageProps' " w:xpath="/ns0:CoverPageProperties[1]/ns0:CompanyEmail[1]" w:storeItemID="{55AF091B-3C7A-41E3-B477-F2FDAA23CFDA}"/>
                                     <w:text/>
                                   </w:sdtPr>
-                                  <w:sdtEndPr/>
                                   <w:sdtContent>
                                     <w:r>
                                       <w:rPr>
@@ -464,7 +461,6 @@
                             <w:dataBinding w:prefixMappings="xmlns:ns0='http://purl.org/dc/elements/1.1/' xmlns:ns1='http://schemas.openxmlformats.org/package/2006/metadata/core-properties' " w:xpath="/ns1:coreProperties[1]/ns0:creator[1]" w:storeItemID="{6C3C8BC8-F283-45AE-878A-BAB7291924A1}"/>
                             <w:text/>
                           </w:sdtPr>
-                          <w:sdtEndPr/>
                           <w:sdtContent>
                             <w:p>
                               <w:pPr>
@@ -514,7 +510,6 @@
                               <w:dataBinding w:prefixMappings="xmlns:ns0='http://schemas.microsoft.com/office/2006/coverPageProps' " w:xpath="/ns0:CoverPageProperties[1]/ns0:CompanyEmail[1]" w:storeItemID="{55AF091B-3C7A-41E3-B477-F2FDAA23CFDA}"/>
                               <w:text/>
                             </w:sdtPr>
-                            <w:sdtEndPr/>
                             <w:sdtContent>
                               <w:r>
                                 <w:rPr>
@@ -624,7 +619,6 @@
                                     <w:dataBinding w:prefixMappings="xmlns:ns0='http://schemas.microsoft.com/office/2006/coverPageProps' " w:xpath="/ns0:CoverPageProperties[1]/ns0:Abstract[1]" w:storeItemID="{55AF091B-3C7A-41E3-B477-F2FDAA23CFDA}"/>
                                     <w:text w:multiLine="1"/>
                                   </w:sdtPr>
-                                  <w:sdtEndPr/>
                                   <w:sdtContent>
                                     <w:r>
                                       <w:rPr>
@@ -877,7 +871,6 @@
                               <w:dataBinding w:prefixMappings="xmlns:ns0='http://schemas.microsoft.com/office/2006/coverPageProps' " w:xpath="/ns0:CoverPageProperties[1]/ns0:Abstract[1]" w:storeItemID="{55AF091B-3C7A-41E3-B477-F2FDAA23CFDA}"/>
                               <w:text w:multiLine="1"/>
                             </w:sdtPr>
-                            <w:sdtEndPr/>
                             <w:sdtContent>
                               <w:r>
                                 <w:rPr>
@@ -1174,7 +1167,6 @@
                                     <w:dataBinding w:prefixMappings="xmlns:ns0='http://purl.org/dc/elements/1.1/' xmlns:ns1='http://schemas.openxmlformats.org/package/2006/metadata/core-properties' " w:xpath="/ns1:coreProperties[1]/ns0:title[1]" w:storeItemID="{6C3C8BC8-F283-45AE-878A-BAB7291924A1}"/>
                                     <w:text w:multiLine="1"/>
                                   </w:sdtPr>
-                                  <w:sdtEndPr/>
                                   <w:sdtContent>
                                     <w:r>
                                       <w:rPr>
@@ -1255,7 +1247,6 @@
                                   <w:dataBinding w:prefixMappings="xmlns:ns0='http://purl.org/dc/elements/1.1/' xmlns:ns1='http://schemas.openxmlformats.org/package/2006/metadata/core-properties' " w:xpath="/ns1:coreProperties[1]/ns0:subject[1]" w:storeItemID="{6C3C8BC8-F283-45AE-878A-BAB7291924A1}"/>
                                   <w:text/>
                                 </w:sdtPr>
-                                <w:sdtEndPr/>
                                 <w:sdtContent>
                                   <w:p>
                                     <w:pPr>
@@ -1326,7 +1317,6 @@
                               <w:dataBinding w:prefixMappings="xmlns:ns0='http://purl.org/dc/elements/1.1/' xmlns:ns1='http://schemas.openxmlformats.org/package/2006/metadata/core-properties' " w:xpath="/ns1:coreProperties[1]/ns0:title[1]" w:storeItemID="{6C3C8BC8-F283-45AE-878A-BAB7291924A1}"/>
                               <w:text w:multiLine="1"/>
                             </w:sdtPr>
-                            <w:sdtEndPr/>
                             <w:sdtContent>
                               <w:r>
                                 <w:rPr>
@@ -1407,7 +1397,6 @@
                             <w:dataBinding w:prefixMappings="xmlns:ns0='http://purl.org/dc/elements/1.1/' xmlns:ns1='http://schemas.openxmlformats.org/package/2006/metadata/core-properties' " w:xpath="/ns1:coreProperties[1]/ns0:subject[1]" w:storeItemID="{6C3C8BC8-F283-45AE-878A-BAB7291924A1}"/>
                             <w:text/>
                           </w:sdtPr>
-                          <w:sdtEndPr/>
                           <w:sdtContent>
                             <w:p>
                               <w:pPr>
@@ -1812,7 +1801,20 @@
                 <w:rStyle w:val="Hyperlink"/>
                 <w:noProof/>
               </w:rPr>
-              <w:t>False Link-State Advertisement Propagation</w:t>
+              <w:t>False Link-State Advertisement</w:t>
+            </w:r>
+            <w:r>
+              <w:t xml:space="preserve"> </w:t>
+            </w:r>
+            <w:r>
+              <w:t>DDOS and</w:t>
+            </w:r>
+            <w:r>
+              <w:rPr>
+                <w:rStyle w:val="Hyperlink"/>
+                <w:noProof/>
+              </w:rPr>
+              <w:t xml:space="preserve"> Propagation</w:t>
             </w:r>
             <w:r>
               <w:rPr>
@@ -3294,7 +3296,6 @@
           <w:id w:val="-1297758375"/>
           <w:citation/>
         </w:sdtPr>
-        <w:sdtEndPr/>
         <w:sdtContent>
           <w:r>
             <w:fldChar w:fldCharType="begin"/>
@@ -3345,7 +3346,6 @@
           <w:id w:val="-1291747706"/>
           <w:citation/>
         </w:sdtPr>
-        <w:sdtEndPr/>
         <w:sdtContent>
           <w:r>
             <w:fldChar w:fldCharType="begin"/>
@@ -3414,7 +3414,6 @@
           <w:id w:val="1887368682"/>
           <w:citation/>
         </w:sdtPr>
-        <w:sdtEndPr/>
         <w:sdtContent>
           <w:r>
             <w:fldChar w:fldCharType="begin"/>
@@ -3517,7 +3516,6 @@
           <w:id w:val="192898342"/>
           <w:citation/>
         </w:sdtPr>
-        <w:sdtEndPr/>
         <w:sdtContent>
           <w:r>
             <w:fldChar w:fldCharType="begin"/>
@@ -3568,7 +3566,6 @@
           <w:id w:val="-481625901"/>
           <w:citation/>
         </w:sdtPr>
-        <w:sdtEndPr/>
         <w:sdtContent>
           <w:r>
             <w:fldChar w:fldCharType="begin"/>
@@ -3604,7 +3601,6 @@
           <w:id w:val="299966716"/>
           <w:citation/>
         </w:sdtPr>
-        <w:sdtEndPr/>
         <w:sdtContent>
           <w:r>
             <w:fldChar w:fldCharType="begin"/>
@@ -3660,7 +3656,6 @@
           <w:id w:val="1620797545"/>
           <w:citation/>
         </w:sdtPr>
-        <w:sdtEndPr/>
         <w:sdtContent>
           <w:r>
             <w:fldChar w:fldCharType="begin"/>
@@ -4946,13 +4941,37 @@
         <w:t>False Link-State Advertisement</w:t>
       </w:r>
       <w:r>
-        <w:t xml:space="preserve"> Propagation</w:t>
+        <w:t xml:space="preserve"> </w:t>
+      </w:r>
+      <w:r>
+        <w:t xml:space="preserve">DDOS and </w:t>
+      </w:r>
+      <w:r>
+        <w:t>Propagation</w:t>
       </w:r>
       <w:bookmarkEnd w:id="4"/>
     </w:p>
     <w:p>
       <w:r>
-        <w:t xml:space="preserve">Now, to do something additionally malicious, I will send a false link-state advertisement to poison the </w:t>
+        <w:t xml:space="preserve">Now, to do something additionally malicious, I will send </w:t>
+      </w:r>
+      <w:r>
+        <w:t>100,000</w:t>
+      </w:r>
+      <w:r>
+        <w:t xml:space="preserve"> false link-state advertisement</w:t>
+      </w:r>
+      <w:r>
+        <w:t>s in multiple cpu threads</w:t>
+      </w:r>
+      <w:r>
+        <w:t xml:space="preserve"> to </w:t>
+      </w:r>
+      <w:r>
+        <w:t>DDOS</w:t>
+      </w:r>
+      <w:r>
+        <w:t xml:space="preserve"> the </w:t>
       </w:r>
       <w:r>
         <w:t>target</w:t>
@@ -4978,10 +4997,22 @@
         </w:numPr>
       </w:pPr>
       <w:r>
-        <w:t>Send an OSPF Type 4</w:t>
-      </w:r>
-      <w:r>
-        <w:t xml:space="preserve"> link-state update packet containing a list of</w:t>
+        <w:t xml:space="preserve">Send </w:t>
+      </w:r>
+      <w:r>
+        <w:t>100,000</w:t>
+      </w:r>
+      <w:r>
+        <w:t xml:space="preserve"> OSPF Type 4</w:t>
+      </w:r>
+      <w:r>
+        <w:t xml:space="preserve"> link-state update packet</w:t>
+      </w:r>
+      <w:r>
+        <w:t>s</w:t>
+      </w:r>
+      <w:r>
+        <w:t xml:space="preserve"> containing a list of</w:t>
       </w:r>
       <w:r>
         <w:t xml:space="preserve"> false</w:t>
@@ -5042,6 +5073,18 @@
       </w:r>
       <w:r>
         <w:t xml:space="preserve"> link information update packets.</w:t>
+      </w:r>
+    </w:p>
+    <w:p>
+      <w:pPr>
+        <w:pStyle w:val="ListParagraph"/>
+        <w:numPr>
+          <w:ilvl w:val="0"/>
+          <w:numId w:val="5"/>
+        </w:numPr>
+      </w:pPr>
+      <w:r>
+        <w:t>PC1 and PC2 will report “Request Timed Out” as DDOS becomes successful.</w:t>
       </w:r>
     </w:p>
     <w:p>
@@ -7252,7 +7295,6 @@
           <w:docPartUnique/>
         </w:docPartObj>
       </w:sdtPr>
-      <w:sdtEndPr/>
       <w:sdtContent>
         <w:p>
           <w:pPr>
@@ -7268,7 +7310,6 @@
             <w:id w:val="-573587230"/>
             <w:bibliography/>
           </w:sdtPr>
-          <w:sdtEndPr/>
           <w:sdtContent>
             <w:p>
               <w:pPr>
@@ -10737,6 +10778,23 @@
 </file>
 
 <file path=customXml/item3.xml><?xml version="1.0" encoding="utf-8"?>
+<p:properties xmlns:p="http://schemas.microsoft.com/office/2006/metadata/properties" xmlns:xsi="http://www.w3.org/2001/XMLSchema-instance" xmlns:pc="http://schemas.microsoft.com/office/infopath/2007/PartnerControls">
+  <documentManagement>
+    <_activity xmlns="4de87c63-80bc-4de5-9897-716620c82037" xsi:nil="true"/>
+  </documentManagement>
+</p:properties>
+</file>
+
+<file path=customXml/item4.xml><?xml version="1.0" encoding="utf-8"?>
+<?mso-contentType ?>
+<FormTemplates xmlns="http://schemas.microsoft.com/sharepoint/v3/contenttype/forms">
+  <Display>DocumentLibraryForm</Display>
+  <Edit>DocumentLibraryForm</Edit>
+  <New>DocumentLibraryForm</New>
+</FormTemplates>
+</file>
+
+<file path=customXml/item5.xml><?xml version="1.0" encoding="utf-8"?>
 <ct:contentTypeSchema xmlns:ct="http://schemas.microsoft.com/office/2006/metadata/contentType" xmlns:ma="http://schemas.microsoft.com/office/2006/metadata/properties/metaAttributes" ct:_="" ma:_="" ma:contentTypeName="Document" ma:contentTypeID="0x010100BDE3E5F3ECEDDD4AA77585492029EF36" ma:contentTypeVersion="11" ma:contentTypeDescription="Create a new document." ma:contentTypeScope="" ma:versionID="e4357a6c6740e22699844eacea296d1f">
   <xsd:schema xmlns:xsd="http://www.w3.org/2001/XMLSchema" xmlns:xs="http://www.w3.org/2001/XMLSchema" xmlns:p="http://schemas.microsoft.com/office/2006/metadata/properties" xmlns:ns3="4de87c63-80bc-4de5-9897-716620c82037" targetNamespace="http://schemas.microsoft.com/office/2006/metadata/properties" ma:root="true" ma:fieldsID="b72081162410240ce839d96983a29a36" ns3:_="">
     <xsd:import namespace="4de87c63-80bc-4de5-9897-716620c82037"/>
@@ -10924,23 +10982,6 @@
 </ct:contentTypeSchema>
 </file>
 
-<file path=customXml/item4.xml><?xml version="1.0" encoding="utf-8"?>
-<?mso-contentType ?>
-<FormTemplates xmlns="http://schemas.microsoft.com/sharepoint/v3/contenttype/forms">
-  <Display>DocumentLibraryForm</Display>
-  <Edit>DocumentLibraryForm</Edit>
-  <New>DocumentLibraryForm</New>
-</FormTemplates>
-</file>
-
-<file path=customXml/item5.xml><?xml version="1.0" encoding="utf-8"?>
-<p:properties xmlns:p="http://schemas.microsoft.com/office/2006/metadata/properties" xmlns:xsi="http://www.w3.org/2001/XMLSchema-instance" xmlns:pc="http://schemas.microsoft.com/office/infopath/2007/PartnerControls">
-  <documentManagement>
-    <_activity xmlns="4de87c63-80bc-4de5-9897-716620c82037" xsi:nil="true"/>
-  </documentManagement>
-</p:properties>
-</file>
-
 <file path=customXml/itemProps1.xml><?xml version="1.0" encoding="utf-8"?>
 <ds:datastoreItem xmlns:ds="http://schemas.openxmlformats.org/officeDocument/2006/customXml" ds:itemID="{55AF091B-3C7A-41E3-B477-F2FDAA23CFDA}">
   <ds:schemaRefs>
@@ -10958,6 +10999,24 @@
 </file>
 
 <file path=customXml/itemProps3.xml><?xml version="1.0" encoding="utf-8"?>
+<ds:datastoreItem xmlns:ds="http://schemas.openxmlformats.org/officeDocument/2006/customXml" ds:itemID="{82FB54C6-F040-4658-9002-EF52DA7E1670}">
+  <ds:schemaRefs>
+    <ds:schemaRef ds:uri="http://schemas.microsoft.com/office/2006/metadata/properties"/>
+    <ds:schemaRef ds:uri="http://schemas.microsoft.com/office/infopath/2007/PartnerControls"/>
+    <ds:schemaRef ds:uri="4de87c63-80bc-4de5-9897-716620c82037"/>
+  </ds:schemaRefs>
+</ds:datastoreItem>
+</file>
+
+<file path=customXml/itemProps4.xml><?xml version="1.0" encoding="utf-8"?>
+<ds:datastoreItem xmlns:ds="http://schemas.openxmlformats.org/officeDocument/2006/customXml" ds:itemID="{1C3753C7-B740-484E-BF62-5D4A0F53D286}">
+  <ds:schemaRefs>
+    <ds:schemaRef ds:uri="http://schemas.microsoft.com/sharepoint/v3/contenttype/forms"/>
+  </ds:schemaRefs>
+</ds:datastoreItem>
+</file>
+
+<file path=customXml/itemProps5.xml><?xml version="1.0" encoding="utf-8"?>
 <ds:datastoreItem xmlns:ds="http://schemas.openxmlformats.org/officeDocument/2006/customXml" ds:itemID="{FD7ABA7C-7EC2-486C-8BE8-78CDCA0FE8C0}">
   <ds:schemaRefs>
     <ds:schemaRef ds:uri="http://schemas.microsoft.com/office/2006/metadata/contentType"/>
@@ -10975,30 +11034,6 @@
 </ds:datastoreItem>
 </file>
 
-<file path=customXml/itemProps4.xml><?xml version="1.0" encoding="utf-8"?>
-<ds:datastoreItem xmlns:ds="http://schemas.openxmlformats.org/officeDocument/2006/customXml" ds:itemID="{1C3753C7-B740-484E-BF62-5D4A0F53D286}">
-  <ds:schemaRefs>
-    <ds:schemaRef ds:uri="http://schemas.microsoft.com/sharepoint/v3/contenttype/forms"/>
-  </ds:schemaRefs>
-</ds:datastoreItem>
-</file>
-
-<file path=customXml/itemProps5.xml><?xml version="1.0" encoding="utf-8"?>
-<ds:datastoreItem xmlns:ds="http://schemas.openxmlformats.org/officeDocument/2006/customXml" ds:itemID="{82FB54C6-F040-4658-9002-EF52DA7E1670}">
-  <ds:schemaRefs>
-    <ds:schemaRef ds:uri="http://www.w3.org/XML/1998/namespace"/>
-    <ds:schemaRef ds:uri="http://purl.org/dc/terms/"/>
-    <ds:schemaRef ds:uri="http://schemas.microsoft.com/office/2006/metadata/properties"/>
-    <ds:schemaRef ds:uri="http://schemas.microsoft.com/office/2006/documentManagement/types"/>
-    <ds:schemaRef ds:uri="http://purl.org/dc/elements/1.1/"/>
-    <ds:schemaRef ds:uri="4de87c63-80bc-4de5-9897-716620c82037"/>
-    <ds:schemaRef ds:uri="http://schemas.microsoft.com/office/infopath/2007/PartnerControls"/>
-    <ds:schemaRef ds:uri="http://schemas.openxmlformats.org/package/2006/metadata/core-properties"/>
-    <ds:schemaRef ds:uri="http://purl.org/dc/dcmitype/"/>
-  </ds:schemaRefs>
-</ds:datastoreItem>
-</file>
-
 <file path=docMetadata/LabelInfo.xml><?xml version="1.0" encoding="utf-8"?>
 <clbl:labelList xmlns:clbl="http://schemas.microsoft.com/office/2020/mipLabelMetadata">
   <clbl:label id="{beb276ac-6e9f-498e-8e31-019ee666decd}" enabled="0" method="" siteId="{beb276ac-6e9f-498e-8e31-019ee666decd}" removed="1"/>

</xml_diff>

<commit_message>
Additional pcap & screenshots for DDOS
</commit_message>
<xml_diff>
--- a/ICT2502C Network Security AY2324 Trimester 3 Assignment on Real-World Network Attacks and Defenses.docx
+++ b/ICT2502C Network Security AY2324 Trimester 3 Assignment on Real-World Network Attacks and Defenses.docx
@@ -4962,7 +4962,15 @@
         <w:t xml:space="preserve"> false link-state advertisement</w:t>
       </w:r>
       <w:r>
-        <w:t>s in multiple cpu threads</w:t>
+        <w:t xml:space="preserve">s in multiple </w:t>
+      </w:r>
+      <w:proofErr w:type="spellStart"/>
+      <w:r>
+        <w:t>cpu</w:t>
+      </w:r>
+      <w:proofErr w:type="spellEnd"/>
+      <w:r>
+        <w:t xml:space="preserve"> threads</w:t>
       </w:r>
       <w:r>
         <w:t xml:space="preserve"> to </w:t>
@@ -6779,16 +6787,21 @@
       </w:r>
     </w:p>
     <w:p>
+      <w:pPr>
+        <w:rPr>
+          <w:sz w:val="18"/>
+          <w:szCs w:val="18"/>
+        </w:rPr>
+      </w:pPr>
       <w:r>
         <w:rPr>
           <w:noProof/>
         </w:rPr>
-        <w:lastRenderedPageBreak/>
         <w:drawing>
-          <wp:inline distT="0" distB="0" distL="0" distR="0" wp14:anchorId="3F609513" wp14:editId="56533468">
-            <wp:extent cx="3268807" cy="7191375"/>
-            <wp:effectExtent l="0" t="0" r="8255" b="0"/>
-            <wp:docPr id="70137300" name="Picture 9" descr="A screenshot of a computer&#10;&#10;Description automatically generated"/>
+          <wp:inline distT="0" distB="0" distL="0" distR="0" wp14:anchorId="3882F900" wp14:editId="6C101CA2">
+            <wp:extent cx="6267450" cy="4200525"/>
+            <wp:effectExtent l="0" t="0" r="0" b="9525"/>
+            <wp:docPr id="2101646757" name="Picture 6"/>
             <wp:cNvGraphicFramePr>
               <a:graphicFrameLocks xmlns:a="http://schemas.openxmlformats.org/drawingml/2006/main" noChangeAspect="1"/>
             </wp:cNvGraphicFramePr>
@@ -6796,7 +6809,7 @@
               <a:graphicData uri="http://schemas.openxmlformats.org/drawingml/2006/picture">
                 <pic:pic xmlns:pic="http://schemas.openxmlformats.org/drawingml/2006/picture">
                   <pic:nvPicPr>
-                    <pic:cNvPr id="70137300" name="Picture 9" descr="A screenshot of a computer&#10;&#10;Description automatically generated"/>
+                    <pic:cNvPr id="0" name="Picture 1"/>
                     <pic:cNvPicPr>
                       <a:picLocks noChangeAspect="1" noChangeArrowheads="1"/>
                     </pic:cNvPicPr>
@@ -6817,7 +6830,7 @@
                   <pic:spPr bwMode="auto">
                     <a:xfrm>
                       <a:off x="0" y="0"/>
-                      <a:ext cx="3276067" cy="7207347"/>
+                      <a:ext cx="6267450" cy="4200525"/>
                     </a:xfrm>
                     <a:prstGeom prst="rect">
                       <a:avLst/>
@@ -6834,14 +6847,118 @@
         </w:drawing>
       </w:r>
       <w:r>
+        <w:br/>
+      </w:r>
+      <w:r>
+        <w:rPr>
+          <w:sz w:val="18"/>
+          <w:szCs w:val="18"/>
+        </w:rPr>
+        <w:t xml:space="preserve">Screenshot from </w:t>
+      </w:r>
+      <w:r>
+        <w:rPr>
+          <w:sz w:val="18"/>
+          <w:szCs w:val="18"/>
+        </w:rPr>
+        <w:t>Wireshark</w:t>
+      </w:r>
+      <w:r>
+        <w:rPr>
+          <w:sz w:val="18"/>
+          <w:szCs w:val="18"/>
+        </w:rPr>
+        <w:t xml:space="preserve"> showing </w:t>
+      </w:r>
+      <w:r>
+        <w:rPr>
+          <w:sz w:val="18"/>
+          <w:szCs w:val="18"/>
+        </w:rPr>
+        <w:t>script starting, progressing through states and achieving FULL state, then LSA poison</w:t>
+      </w:r>
+      <w:r>
+        <w:rPr>
+          <w:sz w:val="18"/>
+          <w:szCs w:val="18"/>
+        </w:rPr>
+        <w:t xml:space="preserve"> DDOS</w:t>
+      </w:r>
+      <w:r>
+        <w:rPr>
+          <w:sz w:val="18"/>
+          <w:szCs w:val="18"/>
+        </w:rPr>
+        <w:t xml:space="preserve"> being sent and then receiving acknowledgement (</w:t>
+      </w:r>
+      <w:proofErr w:type="spellStart"/>
+      <w:r>
+        <w:rPr>
+          <w:sz w:val="18"/>
+          <w:szCs w:val="18"/>
+        </w:rPr>
+        <w:t>Poison_Prop</w:t>
+      </w:r>
+      <w:proofErr w:type="spellEnd"/>
+      <w:r>
+        <w:rPr>
+          <w:sz w:val="18"/>
+          <w:szCs w:val="18"/>
+        </w:rPr>
+        <w:t xml:space="preserve"> Propagated)</w:t>
+      </w:r>
+      <w:r>
+        <w:rPr>
+          <w:sz w:val="18"/>
+          <w:szCs w:val="18"/>
+        </w:rPr>
+        <w:t xml:space="preserve"> from R1 about the poison Link-State Update</w:t>
+      </w:r>
+    </w:p>
+    <w:p>
+      <w:pPr>
+        <w:rPr>
+          <w:sz w:val="18"/>
+          <w:szCs w:val="18"/>
+        </w:rPr>
+      </w:pPr>
+    </w:p>
+    <w:p>
+      <w:pPr>
+        <w:rPr>
+          <w:sz w:val="18"/>
+          <w:szCs w:val="18"/>
+        </w:rPr>
+      </w:pPr>
+    </w:p>
+    <w:p>
+      <w:pPr>
         <w:rPr>
           <w:noProof/>
+          <w:sz w:val="18"/>
+          <w:szCs w:val="18"/>
+        </w:rPr>
+      </w:pPr>
+    </w:p>
+    <w:p>
+      <w:pPr>
+        <w:rPr>
+          <w:noProof/>
+          <w:sz w:val="18"/>
+          <w:szCs w:val="18"/>
+        </w:rPr>
+      </w:pPr>
+      <w:r>
+        <w:rPr>
+          <w:noProof/>
+          <w:sz w:val="18"/>
+          <w:szCs w:val="18"/>
         </w:rPr>
         <w:drawing>
-          <wp:inline distT="0" distB="0" distL="0" distR="0" wp14:anchorId="4594890C" wp14:editId="1B53FDB4">
-            <wp:extent cx="2993621" cy="5179325"/>
-            <wp:effectExtent l="0" t="0" r="0" b="2540"/>
-            <wp:docPr id="1035004825" name="Picture 11" descr="A screenshot of a computer program&#10;&#10;Description automatically generated"/>
+          <wp:inline distT="0" distB="0" distL="0" distR="0" wp14:anchorId="59C52A52" wp14:editId="2E8A43B7">
+            <wp:extent cx="2343150" cy="7048500"/>
+            <wp:effectExtent l="0" t="0" r="0" b="0"/>
+            <wp:docPr id="1093937921" name="Picture 9"/>
             <wp:cNvGraphicFramePr>
               <a:graphicFrameLocks xmlns:a="http://schemas.openxmlformats.org/drawingml/2006/main" noChangeAspect="1"/>
             </wp:cNvGraphicFramePr>
@@ -6849,12 +6966,12 @@
               <a:graphicData uri="http://schemas.openxmlformats.org/drawingml/2006/picture">
                 <pic:pic xmlns:pic="http://schemas.openxmlformats.org/drawingml/2006/picture">
                   <pic:nvPicPr>
-                    <pic:cNvPr id="1035004825" name="Picture 11" descr="A screenshot of a computer program&#10;&#10;Description automatically generated"/>
+                    <pic:cNvPr id="0" name="Picture 4"/>
                     <pic:cNvPicPr>
                       <a:picLocks noChangeAspect="1" noChangeArrowheads="1"/>
                     </pic:cNvPicPr>
                   </pic:nvPicPr>
-                  <pic:blipFill>
+                  <pic:blipFill rotWithShape="1">
                     <a:blip r:embed="rId20">
                       <a:extLst>
                         <a:ext uri="{28A0092B-C50C-407E-A947-70E740481C1C}">
@@ -6862,15 +6979,13 @@
                         </a:ext>
                       </a:extLst>
                     </a:blip>
-                    <a:srcRect/>
-                    <a:stretch>
-                      <a:fillRect/>
-                    </a:stretch>
+                    <a:srcRect r="62614"/>
+                    <a:stretch/>
                   </pic:blipFill>
                   <pic:spPr bwMode="auto">
                     <a:xfrm>
                       <a:off x="0" y="0"/>
-                      <a:ext cx="2998171" cy="5187198"/>
+                      <a:ext cx="2343150" cy="7048500"/>
                     </a:xfrm>
                     <a:prstGeom prst="rect">
                       <a:avLst/>
@@ -6879,6 +6994,11 @@
                     <a:ln>
                       <a:noFill/>
                     </a:ln>
+                    <a:extLst>
+                      <a:ext uri="{53640926-AAD7-44D8-BBD7-CCE9431645EC}">
+                        <a14:shadowObscured xmlns:a14="http://schemas.microsoft.com/office/drawing/2010/main"/>
+                      </a:ext>
+                    </a:extLst>
                   </pic:spPr>
                 </pic:pic>
               </a:graphicData>
@@ -6887,28 +7007,91 @@
         </w:drawing>
       </w:r>
       <w:r>
-        <w:br/>
-      </w:r>
-      <w:r>
-        <w:rPr>
+        <w:rPr>
+          <w:noProof/>
           <w:sz w:val="18"/>
           <w:szCs w:val="18"/>
         </w:rPr>
-        <w:t xml:space="preserve">Screenshot from Kali Linux showing </w:t>
-      </w:r>
-      <w:r>
-        <w:rPr>
+        <w:t xml:space="preserve">     </w:t>
+      </w:r>
+      <w:r>
+        <w:rPr>
+          <w:noProof/>
           <w:sz w:val="18"/>
           <w:szCs w:val="18"/>
         </w:rPr>
-        <w:t>script starting, progressing through states and achieving FULL state, then LSA poison being sent and then receiving acknowledgement (Poison_Prop Propagated)</w:t>
+        <w:drawing>
+          <wp:inline distT="0" distB="0" distL="0" distR="0" wp14:anchorId="326A7842" wp14:editId="1079425F">
+            <wp:extent cx="2362200" cy="7048500"/>
+            <wp:effectExtent l="0" t="0" r="0" b="0"/>
+            <wp:docPr id="1195455183" name="Picture 10"/>
+            <wp:cNvGraphicFramePr>
+              <a:graphicFrameLocks xmlns:a="http://schemas.openxmlformats.org/drawingml/2006/main" noChangeAspect="1"/>
+            </wp:cNvGraphicFramePr>
+            <a:graphic xmlns:a="http://schemas.openxmlformats.org/drawingml/2006/main">
+              <a:graphicData uri="http://schemas.openxmlformats.org/drawingml/2006/picture">
+                <pic:pic xmlns:pic="http://schemas.openxmlformats.org/drawingml/2006/picture">
+                  <pic:nvPicPr>
+                    <pic:cNvPr id="0" name="Picture 5"/>
+                    <pic:cNvPicPr>
+                      <a:picLocks noChangeAspect="1" noChangeArrowheads="1"/>
+                    </pic:cNvPicPr>
+                  </pic:nvPicPr>
+                  <pic:blipFill rotWithShape="1">
+                    <a:blip r:embed="rId21">
+                      <a:extLst>
+                        <a:ext uri="{28A0092B-C50C-407E-A947-70E740481C1C}">
+                          <a14:useLocalDpi xmlns:a14="http://schemas.microsoft.com/office/drawing/2010/main" val="0"/>
+                        </a:ext>
+                      </a:extLst>
+                    </a:blip>
+                    <a:srcRect r="62311"/>
+                    <a:stretch/>
+                  </pic:blipFill>
+                  <pic:spPr bwMode="auto">
+                    <a:xfrm>
+                      <a:off x="0" y="0"/>
+                      <a:ext cx="2362200" cy="7048500"/>
+                    </a:xfrm>
+                    <a:prstGeom prst="rect">
+                      <a:avLst/>
+                    </a:prstGeom>
+                    <a:noFill/>
+                    <a:ln>
+                      <a:noFill/>
+                    </a:ln>
+                    <a:extLst>
+                      <a:ext uri="{53640926-AAD7-44D8-BBD7-CCE9431645EC}">
+                        <a14:shadowObscured xmlns:a14="http://schemas.microsoft.com/office/drawing/2010/main"/>
+                      </a:ext>
+                    </a:extLst>
+                  </pic:spPr>
+                </pic:pic>
+              </a:graphicData>
+            </a:graphic>
+          </wp:inline>
+        </w:drawing>
       </w:r>
       <w:r>
         <w:rPr>
           <w:sz w:val="18"/>
           <w:szCs w:val="18"/>
         </w:rPr>
-        <w:t xml:space="preserve"> from R1 about the poison Link-State Update</w:t>
+        <w:br/>
+      </w:r>
+      <w:r>
+        <w:rPr>
+          <w:sz w:val="18"/>
+          <w:szCs w:val="18"/>
+        </w:rPr>
+        <w:t xml:space="preserve">Screenshot </w:t>
+      </w:r>
+      <w:r>
+        <w:rPr>
+          <w:sz w:val="18"/>
+          <w:szCs w:val="18"/>
+        </w:rPr>
+        <w:t>from PC1 and PC2 cli showing DDOS worsening ping and then ruining it entirely.</w:t>
       </w:r>
     </w:p>
     <w:p/>
@@ -6970,7 +7153,7 @@
                     </pic:cNvPicPr>
                   </pic:nvPicPr>
                   <pic:blipFill>
-                    <a:blip r:embed="rId21">
+                    <a:blip r:embed="rId22">
                       <a:extLst>
                         <a:ext uri="{28A0092B-C50C-407E-A947-70E740481C1C}">
                           <a14:useLocalDpi xmlns:a14="http://schemas.microsoft.com/office/drawing/2010/main" val="0"/>
@@ -7050,7 +7233,7 @@
                     </pic:cNvPicPr>
                   </pic:nvPicPr>
                   <pic:blipFill>
-                    <a:blip r:embed="rId22">
+                    <a:blip r:embed="rId23">
                       <a:extLst>
                         <a:ext uri="{28A0092B-C50C-407E-A947-70E740481C1C}">
                           <a14:useLocalDpi xmlns:a14="http://schemas.microsoft.com/office/drawing/2010/main" val="0"/>
@@ -7131,7 +7314,7 @@
                     </pic:cNvPicPr>
                   </pic:nvPicPr>
                   <pic:blipFill>
-                    <a:blip r:embed="rId23">
+                    <a:blip r:embed="rId24">
                       <a:extLst>
                         <a:ext uri="{28A0092B-C50C-407E-A947-70E740481C1C}">
                           <a14:useLocalDpi xmlns:a14="http://schemas.microsoft.com/office/drawing/2010/main" val="0"/>
@@ -7218,7 +7401,7 @@
                     </pic:cNvPicPr>
                   </pic:nvPicPr>
                   <pic:blipFill>
-                    <a:blip r:embed="rId24">
+                    <a:blip r:embed="rId25">
                       <a:extLst>
                         <a:ext uri="{28A0092B-C50C-407E-A947-70E740481C1C}">
                           <a14:useLocalDpi xmlns:a14="http://schemas.microsoft.com/office/drawing/2010/main" val="0"/>
@@ -7255,7 +7438,23 @@
           <w:szCs w:val="18"/>
         </w:rPr>
         <w:br/>
-        <w:t>My script failing to establish adjacency and move up through the OSPF states, stuck at Hello_Responded.</w:t>
+        <w:t xml:space="preserve">My script failing to establish adjacency and move up through the OSPF states, stuck at </w:t>
+      </w:r>
+      <w:proofErr w:type="spellStart"/>
+      <w:r>
+        <w:rPr>
+          <w:sz w:val="18"/>
+          <w:szCs w:val="18"/>
+        </w:rPr>
+        <w:t>Hello_Responded</w:t>
+      </w:r>
+      <w:proofErr w:type="spellEnd"/>
+      <w:r>
+        <w:rPr>
+          <w:sz w:val="18"/>
+          <w:szCs w:val="18"/>
+        </w:rPr>
+        <w:t>.</w:t>
       </w:r>
     </w:p>
     <w:p>
@@ -7775,12 +7974,12 @@
     <w:p/>
     <w:p/>
     <w:sectPr>
-      <w:headerReference w:type="even" r:id="rId25"/>
-      <w:headerReference w:type="default" r:id="rId26"/>
-      <w:footerReference w:type="even" r:id="rId27"/>
-      <w:footerReference w:type="default" r:id="rId28"/>
-      <w:headerReference w:type="first" r:id="rId29"/>
-      <w:footerReference w:type="first" r:id="rId30"/>
+      <w:headerReference w:type="even" r:id="rId26"/>
+      <w:headerReference w:type="default" r:id="rId27"/>
+      <w:footerReference w:type="even" r:id="rId28"/>
+      <w:footerReference w:type="default" r:id="rId29"/>
+      <w:headerReference w:type="first" r:id="rId30"/>
+      <w:footerReference w:type="first" r:id="rId31"/>
       <w:pgSz w:w="11906" w:h="16838"/>
       <w:pgMar w:top="896" w:right="1134" w:bottom="1134" w:left="896" w:header="964" w:footer="444" w:gutter="0"/>
       <w:pgNumType w:start="0"/>
@@ -10778,23 +10977,6 @@
 </file>
 
 <file path=customXml/item3.xml><?xml version="1.0" encoding="utf-8"?>
-<p:properties xmlns:p="http://schemas.microsoft.com/office/2006/metadata/properties" xmlns:xsi="http://www.w3.org/2001/XMLSchema-instance" xmlns:pc="http://schemas.microsoft.com/office/infopath/2007/PartnerControls">
-  <documentManagement>
-    <_activity xmlns="4de87c63-80bc-4de5-9897-716620c82037" xsi:nil="true"/>
-  </documentManagement>
-</p:properties>
-</file>
-
-<file path=customXml/item4.xml><?xml version="1.0" encoding="utf-8"?>
-<?mso-contentType ?>
-<FormTemplates xmlns="http://schemas.microsoft.com/sharepoint/v3/contenttype/forms">
-  <Display>DocumentLibraryForm</Display>
-  <Edit>DocumentLibraryForm</Edit>
-  <New>DocumentLibraryForm</New>
-</FormTemplates>
-</file>
-
-<file path=customXml/item5.xml><?xml version="1.0" encoding="utf-8"?>
 <ct:contentTypeSchema xmlns:ct="http://schemas.microsoft.com/office/2006/metadata/contentType" xmlns:ma="http://schemas.microsoft.com/office/2006/metadata/properties/metaAttributes" ct:_="" ma:_="" ma:contentTypeName="Document" ma:contentTypeID="0x010100BDE3E5F3ECEDDD4AA77585492029EF36" ma:contentTypeVersion="11" ma:contentTypeDescription="Create a new document." ma:contentTypeScope="" ma:versionID="e4357a6c6740e22699844eacea296d1f">
   <xsd:schema xmlns:xsd="http://www.w3.org/2001/XMLSchema" xmlns:xs="http://www.w3.org/2001/XMLSchema" xmlns:p="http://schemas.microsoft.com/office/2006/metadata/properties" xmlns:ns3="4de87c63-80bc-4de5-9897-716620c82037" targetNamespace="http://schemas.microsoft.com/office/2006/metadata/properties" ma:root="true" ma:fieldsID="b72081162410240ce839d96983a29a36" ns3:_="">
     <xsd:import namespace="4de87c63-80bc-4de5-9897-716620c82037"/>
@@ -10982,6 +11164,23 @@
 </ct:contentTypeSchema>
 </file>
 
+<file path=customXml/item4.xml><?xml version="1.0" encoding="utf-8"?>
+<?mso-contentType ?>
+<FormTemplates xmlns="http://schemas.microsoft.com/sharepoint/v3/contenttype/forms">
+  <Display>DocumentLibraryForm</Display>
+  <Edit>DocumentLibraryForm</Edit>
+  <New>DocumentLibraryForm</New>
+</FormTemplates>
+</file>
+
+<file path=customXml/item5.xml><?xml version="1.0" encoding="utf-8"?>
+<p:properties xmlns:p="http://schemas.microsoft.com/office/2006/metadata/properties" xmlns:xsi="http://www.w3.org/2001/XMLSchema-instance" xmlns:pc="http://schemas.microsoft.com/office/infopath/2007/PartnerControls">
+  <documentManagement>
+    <_activity xmlns="4de87c63-80bc-4de5-9897-716620c82037" xsi:nil="true"/>
+  </documentManagement>
+</p:properties>
+</file>
+
 <file path=customXml/itemProps1.xml><?xml version="1.0" encoding="utf-8"?>
 <ds:datastoreItem xmlns:ds="http://schemas.openxmlformats.org/officeDocument/2006/customXml" ds:itemID="{55AF091B-3C7A-41E3-B477-F2FDAA23CFDA}">
   <ds:schemaRefs>
@@ -10999,24 +11198,6 @@
 </file>
 
 <file path=customXml/itemProps3.xml><?xml version="1.0" encoding="utf-8"?>
-<ds:datastoreItem xmlns:ds="http://schemas.openxmlformats.org/officeDocument/2006/customXml" ds:itemID="{82FB54C6-F040-4658-9002-EF52DA7E1670}">
-  <ds:schemaRefs>
-    <ds:schemaRef ds:uri="http://schemas.microsoft.com/office/2006/metadata/properties"/>
-    <ds:schemaRef ds:uri="http://schemas.microsoft.com/office/infopath/2007/PartnerControls"/>
-    <ds:schemaRef ds:uri="4de87c63-80bc-4de5-9897-716620c82037"/>
-  </ds:schemaRefs>
-</ds:datastoreItem>
-</file>
-
-<file path=customXml/itemProps4.xml><?xml version="1.0" encoding="utf-8"?>
-<ds:datastoreItem xmlns:ds="http://schemas.openxmlformats.org/officeDocument/2006/customXml" ds:itemID="{1C3753C7-B740-484E-BF62-5D4A0F53D286}">
-  <ds:schemaRefs>
-    <ds:schemaRef ds:uri="http://schemas.microsoft.com/sharepoint/v3/contenttype/forms"/>
-  </ds:schemaRefs>
-</ds:datastoreItem>
-</file>
-
-<file path=customXml/itemProps5.xml><?xml version="1.0" encoding="utf-8"?>
 <ds:datastoreItem xmlns:ds="http://schemas.openxmlformats.org/officeDocument/2006/customXml" ds:itemID="{FD7ABA7C-7EC2-486C-8BE8-78CDCA0FE8C0}">
   <ds:schemaRefs>
     <ds:schemaRef ds:uri="http://schemas.microsoft.com/office/2006/metadata/contentType"/>
@@ -11034,6 +11215,24 @@
 </ds:datastoreItem>
 </file>
 
+<file path=customXml/itemProps4.xml><?xml version="1.0" encoding="utf-8"?>
+<ds:datastoreItem xmlns:ds="http://schemas.openxmlformats.org/officeDocument/2006/customXml" ds:itemID="{1C3753C7-B740-484E-BF62-5D4A0F53D286}">
+  <ds:schemaRefs>
+    <ds:schemaRef ds:uri="http://schemas.microsoft.com/sharepoint/v3/contenttype/forms"/>
+  </ds:schemaRefs>
+</ds:datastoreItem>
+</file>
+
+<file path=customXml/itemProps5.xml><?xml version="1.0" encoding="utf-8"?>
+<ds:datastoreItem xmlns:ds="http://schemas.openxmlformats.org/officeDocument/2006/customXml" ds:itemID="{82FB54C6-F040-4658-9002-EF52DA7E1670}">
+  <ds:schemaRefs>
+    <ds:schemaRef ds:uri="http://schemas.microsoft.com/office/2006/metadata/properties"/>
+    <ds:schemaRef ds:uri="http://schemas.microsoft.com/office/infopath/2007/PartnerControls"/>
+    <ds:schemaRef ds:uri="4de87c63-80bc-4de5-9897-716620c82037"/>
+  </ds:schemaRefs>
+</ds:datastoreItem>
+</file>
+
 <file path=docMetadata/LabelInfo.xml><?xml version="1.0" encoding="utf-8"?>
 <clbl:labelList xmlns:clbl="http://schemas.microsoft.com/office/2020/mipLabelMetadata">
   <clbl:label id="{beb276ac-6e9f-498e-8e31-019ee666decd}" enabled="0" method="" siteId="{beb276ac-6e9f-498e-8e31-019ee666decd}" removed="1"/>

</xml_diff>